<commit_message>
Add Mermaid diagram support to Markdown-to-DOCX conversion
Render Mermaid fenced code blocks through a bundled Pandoc Lua filter so the shell and PowerShell wrappers can embed generated diagrams in DOCX output. Add Mermaid media handling, default sizing and centering behavior, and a Puppeteer no-sandbox config for locked-down environments.\n\nDocument the new workflow in the README and skill references, add a Mermaid sample document and generated DOCX, and update installed-skill verification to require the new helper files.
</commit_message>
<xml_diff>
--- a/samples/showcase.docx
+++ b/samples/showcase.docx
@@ -406,7 +406,7 @@
         <w:rPr>
           <w:rStyle w:val="VerbatimChar"/>
         </w:rPr>
-        <w:t xml:space="preserve">scripts/reference.docx</w:t>
+        <w:t xml:space="preserve">skills/markdown-to-docx/scripts/reference.docx</w:t>
       </w:r>
       <w:r>
         <w:t xml:space="preserve"> </w:t>
@@ -488,7 +488,7 @@
         <w:rPr>
           <w:rStyle w:val="VerbatimChar"/>
         </w:rPr>
-        <w:t xml:space="preserve">scripts/reference.docx</w:t>
+        <w:t xml:space="preserve">skills/markdown-to-docx/scripts/reference.docx</w:t>
       </w:r>
       <w:r>
         <w:t xml:space="preserve"> </w:t>
@@ -666,7 +666,7 @@
         <w:rPr>
           <w:rStyle w:val="VerbatimChar"/>
         </w:rPr>
-        <w:t xml:space="preserve">scripts/reference.docx</w:t>
+        <w:t xml:space="preserve">skills/markdown-to-docx/scripts/reference.docx</w:t>
       </w:r>
       <w:r>
         <w:t xml:space="preserve"> </w:t>

</xml_diff>